<commit_message>
docs: add fork/practice and weekly-report sections (English docx)
Completes the fork/practice and weekly-report revision for the English
tutorial — GSTACK_TEAM_MODE_TUTORIAL_CN.docx and both slide decks were
pushed in the prior commit; this file was blocked by a Word file lock
on the author's machine until now.

Same two new sections as the Chinese edition:
1. 'Forking the Repo and Practicing Hands-On' — 7-step walkthrough
2. 'Stuck? File a Weekly Report' — required fields: User's Name,
   Project (Gstack Tutorial #1), Submission Date (day/month/year)

Co-Authored-By: Claude Sonnet 5 <noreply@anthropic.com>
</commit_message>
<xml_diff>
--- a/GSTACK_TEAM_MODE_TUTORIAL.docx
+++ b/GSTACK_TEAM_MODE_TUTORIAL.docx
@@ -1498,6 +1498,481 @@
           <w:szCs w:val="22"/>
         </w:rPr>
         <w:t xml:space="preserve">Troubleshooting and next steps for your team</w:t>
+      </w:r>
+    </w:p>
+    <w:p>
+      <w:r>
+        <w:br w:type="page"/>
+      </w:r>
+    </w:p>
+    <w:p>
+      <w:pPr>
+        <w:pStyle w:val="Heading1"/>
+        <w:pBdr>
+          <w:bottom w:val="single" w:color="1F4E78" w:sz="12" w:space="1"/>
+        </w:pBdr>
+        <w:spacing w:after="200" w:before="0" w:line="360"/>
+      </w:pPr>
+      <w:r>
+        <w:rPr>
+          <w:rFonts w:ascii="Calibri" w:cs="Calibri" w:eastAsia="Calibri" w:hAnsi="Calibri"/>
+          <w:b/>
+          <w:bCs/>
+          <w:color w:val="1F4E78"/>
+          <w:sz w:val="28"/>
+          <w:szCs w:val="28"/>
+        </w:rPr>
+        <w:t xml:space="preserve">Forking the Repo and Practicing Hands-On</w:t>
+      </w:r>
+    </w:p>
+    <w:p>
+      <w:pPr>
+        <w:spacing w:after="300" w:line="240"/>
+      </w:pPr>
+      <w:r>
+        <w:rPr>
+          <w:rFonts w:ascii="Calibri" w:cs="Calibri" w:eastAsia="Calibri" w:hAnsi="Calibri"/>
+          <w:sz w:val="22"/>
+          <w:szCs w:val="22"/>
+        </w:rPr>
+        <w:t xml:space="preserve">Reading this document teaches the concepts. Running the workflow yourself, in your own copy of the repo, is what actually makes it stick. Follow these steps in order.</w:t>
+      </w:r>
+    </w:p>
+    <w:p>
+      <w:pPr>
+        <w:spacing w:after="100" w:before="100" w:line="240"/>
+      </w:pPr>
+      <w:r>
+        <w:rPr>
+          <w:rFonts w:ascii="Calibri" w:cs="Calibri" w:eastAsia="Calibri" w:hAnsi="Calibri"/>
+          <w:b/>
+          <w:bCs/>
+          <w:color w:val="1F4E78"/>
+          <w:sz w:val="22"/>
+          <w:szCs w:val="22"/>
+        </w:rPr>
+        <w:t xml:space="preserve">Step 1 — Get added as a collaborator. </w:t>
+      </w:r>
+      <w:r>
+        <w:rPr>
+          <w:rFonts w:ascii="Calibri" w:cs="Calibri" w:eastAsia="Calibri" w:hAnsi="Calibri"/>
+          <w:sz w:val="22"/>
+          <w:szCs w:val="22"/>
+        </w:rPr>
+        <w:t xml:space="preserve">The tutorial repository is private. Ask the repo owner to add your GitHub username under Settings → Collaborators before you continue.</w:t>
+      </w:r>
+    </w:p>
+    <w:p>
+      <w:pPr>
+        <w:spacing w:after="100" w:before="100" w:line="240"/>
+      </w:pPr>
+      <w:r>
+        <w:rPr>
+          <w:rFonts w:ascii="Calibri" w:cs="Calibri" w:eastAsia="Calibri" w:hAnsi="Calibri"/>
+          <w:b/>
+          <w:bCs/>
+          <w:color w:val="1F4E78"/>
+          <w:sz w:val="22"/>
+          <w:szCs w:val="22"/>
+        </w:rPr>
+        <w:t xml:space="preserve">Step 2 — Fork the repository. </w:t>
+      </w:r>
+      <w:r>
+        <w:rPr>
+          <w:rFonts w:ascii="Calibri" w:cs="Calibri" w:eastAsia="Calibri" w:hAnsi="Calibri"/>
+          <w:sz w:val="22"/>
+          <w:szCs w:val="22"/>
+        </w:rPr>
+        <w:t xml:space="preserve">Go to </w:t>
+      </w:r>
+      <w:r>
+        <w:rPr>
+          <w:rFonts w:ascii="Consolas" w:cs="Consolas" w:eastAsia="Consolas" w:hAnsi="Consolas"/>
+          <w:color w:val="1F4E78"/>
+          <w:sz w:val="22"/>
+          <w:szCs w:val="22"/>
+        </w:rPr>
+        <w:t xml:space="preserve">github.com/mikelix/gstack-tutorial-1</w:t>
+      </w:r>
+      <w:r>
+        <w:rPr>
+          <w:rFonts w:ascii="Calibri" w:cs="Calibri" w:eastAsia="Calibri" w:hAnsi="Calibri"/>
+          <w:sz w:val="22"/>
+          <w:szCs w:val="22"/>
+        </w:rPr>
+        <w:t xml:space="preserve"> and click Fork (top right) → choose your own account as the destination. This creates your own private copy at github.com/YOUR-USERNAME/gstack-tutorial-1.</w:t>
+      </w:r>
+    </w:p>
+    <w:p>
+      <w:pPr>
+        <w:spacing w:after="100" w:before="100" w:line="240"/>
+      </w:pPr>
+      <w:r>
+        <w:rPr>
+          <w:rFonts w:ascii="Calibri" w:cs="Calibri" w:eastAsia="Calibri" w:hAnsi="Calibri"/>
+          <w:b/>
+          <w:bCs/>
+          <w:color w:val="1F4E78"/>
+          <w:sz w:val="22"/>
+          <w:szCs w:val="22"/>
+        </w:rPr>
+        <w:t xml:space="preserve">Step 3 — Clone YOUR fork. </w:t>
+      </w:r>
+      <w:r>
+        <w:rPr>
+          <w:rFonts w:ascii="Calibri" w:cs="Calibri" w:eastAsia="Calibri" w:hAnsi="Calibri"/>
+          <w:sz w:val="22"/>
+          <w:szCs w:val="22"/>
+        </w:rPr>
+        <w:t xml:space="preserve">Not the original. </w:t>
+      </w:r>
+      <w:r>
+        <w:rPr>
+          <w:rFonts w:ascii="Consolas" w:cs="Consolas" w:eastAsia="Consolas" w:hAnsi="Consolas"/>
+          <w:color w:val="1F1F1F"/>
+          <w:sz w:val="20"/>
+          <w:szCs w:val="20"/>
+        </w:rPr>
+        <w:t xml:space="preserve">git clone https://github.com/YOUR-USERNAME/gstack-tutorial-1.git</w:t>
+      </w:r>
+    </w:p>
+    <w:p>
+      <w:pPr>
+        <w:spacing w:after="100" w:before="100" w:line="240"/>
+      </w:pPr>
+      <w:r>
+        <w:rPr>
+          <w:rFonts w:ascii="Calibri" w:cs="Calibri" w:eastAsia="Calibri" w:hAnsi="Calibri"/>
+          <w:b/>
+          <w:bCs/>
+          <w:color w:val="1F4E78"/>
+          <w:sz w:val="22"/>
+          <w:szCs w:val="22"/>
+        </w:rPr>
+        <w:t xml:space="preserve">Step 4 — Open your AI assistant inside the cloned folder. </w:t>
+      </w:r>
+      <w:r>
+        <w:rPr>
+          <w:rFonts w:ascii="Calibri" w:cs="Calibri" w:eastAsia="Calibri" w:hAnsi="Calibri"/>
+          <w:sz w:val="22"/>
+          <w:szCs w:val="22"/>
+        </w:rPr>
+        <w:t xml:space="preserve">Tencent Workbuddy, Claude Code, or OpenAI Codex — whichever you installed.</w:t>
+      </w:r>
+    </w:p>
+    <w:p>
+      <w:pPr>
+        <w:spacing w:after="100" w:before="100" w:line="240"/>
+      </w:pPr>
+      <w:r>
+        <w:rPr>
+          <w:rFonts w:ascii="Calibri" w:cs="Calibri" w:eastAsia="Calibri" w:hAnsi="Calibri"/>
+          <w:b/>
+          <w:bCs/>
+          <w:color w:val="1F4E78"/>
+          <w:sz w:val="22"/>
+          <w:szCs w:val="22"/>
+        </w:rPr>
+        <w:t xml:space="preserve">Step 5 — Ask it to examine the repo. </w:t>
+      </w:r>
+      <w:r>
+        <w:rPr>
+          <w:rFonts w:ascii="Calibri" w:cs="Calibri" w:eastAsia="Calibri" w:hAnsi="Calibri"/>
+          <w:sz w:val="22"/>
+          <w:szCs w:val="22"/>
+        </w:rPr>
+        <w:t xml:space="preserve">Prompt it directly: </w:t>
+      </w:r>
+      <w:r>
+        <w:rPr>
+          <w:rFonts w:ascii="Calibri" w:cs="Calibri" w:eastAsia="Calibri" w:hAnsi="Calibri"/>
+          <w:sz w:val="22"/>
+          <w:szCs w:val="22"/>
+        </w:rPr>
+        <w:t xml:space="preserve">“Read START_HERE.md, PLAN.md, and the five review documents in this repo, then help me run the same five gstack reviews myself.”</w:t>
+      </w:r>
+    </w:p>
+    <w:p>
+      <w:pPr>
+        <w:spacing w:after="100" w:before="100" w:line="240"/>
+      </w:pPr>
+      <w:r>
+        <w:rPr>
+          <w:rFonts w:ascii="Calibri" w:cs="Calibri" w:eastAsia="Calibri" w:hAnsi="Calibri"/>
+          <w:b/>
+          <w:bCs/>
+          <w:color w:val="1F4E78"/>
+          <w:sz w:val="22"/>
+          <w:szCs w:val="22"/>
+        </w:rPr>
+        <w:t xml:space="preserve">Step 6 — Practice the full workflow yourself. </w:t>
+      </w:r>
+      <w:r>
+        <w:rPr>
+          <w:rFonts w:ascii="Calibri" w:cs="Calibri" w:eastAsia="Calibri" w:hAnsi="Calibri"/>
+          <w:sz w:val="22"/>
+          <w:szCs w:val="22"/>
+        </w:rPr>
+        <w:t xml:space="preserve">Install gstack, run all five reviews (CEO → PM → Engineer → implement → QA → DevOps), and commit your own results to your fork as you go.</w:t>
+      </w:r>
+    </w:p>
+    <w:p>
+      <w:pPr>
+        <w:spacing w:after="400" w:before="100" w:line="240"/>
+      </w:pPr>
+      <w:r>
+        <w:rPr>
+          <w:rFonts w:ascii="Calibri" w:cs="Calibri" w:eastAsia="Calibri" w:hAnsi="Calibri"/>
+          <w:b/>
+          <w:bCs/>
+          <w:color w:val="1F4E78"/>
+          <w:sz w:val="22"/>
+          <w:szCs w:val="22"/>
+        </w:rPr>
+        <w:t xml:space="preserve">Step 7 — Keep your fork up to date (optional). </w:t>
+      </w:r>
+      <w:r>
+        <w:rPr>
+          <w:rFonts w:ascii="Consolas" w:cs="Consolas" w:eastAsia="Consolas" w:hAnsi="Consolas"/>
+          <w:color w:val="1F1F1F"/>
+          <w:sz w:val="20"/>
+          <w:szCs w:val="20"/>
+        </w:rPr>
+        <w:t xml:space="preserve">git remote add upstream https://github.com/mikelix/gstack-tutorial-1.git</w:t>
+      </w:r>
+      <w:r>
+        <w:rPr>
+          <w:rFonts w:ascii="Calibri" w:cs="Calibri" w:eastAsia="Calibri" w:hAnsi="Calibri"/>
+          <w:sz w:val="22"/>
+          <w:szCs w:val="22"/>
+        </w:rPr>
+        <w:t xml:space="preserve"> lets you pull future updates from the original repo into your fork.</w:t>
+      </w:r>
+    </w:p>
+    <w:p>
+      <w:r>
+        <w:br w:type="page"/>
+      </w:r>
+    </w:p>
+    <w:p>
+      <w:pPr>
+        <w:pStyle w:val="Heading1"/>
+        <w:pBdr>
+          <w:bottom w:val="single" w:color="1F4E78" w:sz="12" w:space="1"/>
+        </w:pBdr>
+        <w:spacing w:after="200" w:before="0" w:line="360"/>
+      </w:pPr>
+      <w:r>
+        <w:rPr>
+          <w:rFonts w:ascii="Calibri" w:cs="Calibri" w:eastAsia="Calibri" w:hAnsi="Calibri"/>
+          <w:b/>
+          <w:bCs/>
+          <w:color w:val="1F4E78"/>
+          <w:sz w:val="28"/>
+          <w:szCs w:val="28"/>
+        </w:rPr>
+        <w:t xml:space="preserve">Stuck? File a Weekly Report</w:t>
+      </w:r>
+    </w:p>
+    <w:p>
+      <w:pPr>
+        <w:spacing w:after="300" w:line="240"/>
+      </w:pPr>
+      <w:r>
+        <w:rPr>
+          <w:rFonts w:ascii="Calibri" w:cs="Calibri" w:eastAsia="Calibri" w:hAnsi="Calibri"/>
+          <w:sz w:val="22"/>
+          <w:szCs w:val="22"/>
+        </w:rPr>
+        <w:t xml:space="preserve">If you hit a problem you can't resolve — or even if things are going fine — file a short weekly report. This is the single channel the instructor checks for everyone's status, so use it every week, not just when something breaks.</w:t>
+      </w:r>
+    </w:p>
+    <w:p>
+      <w:pPr>
+        <w:spacing w:after="100" w:before="100" w:line="240"/>
+      </w:pPr>
+      <w:r>
+        <w:rPr>
+          <w:rFonts w:ascii="Calibri" w:cs="Calibri" w:eastAsia="Calibri" w:hAnsi="Calibri"/>
+          <w:b/>
+          <w:bCs/>
+          <w:color w:val="1F4E78"/>
+          <w:sz w:val="22"/>
+          <w:szCs w:val="22"/>
+        </w:rPr>
+        <w:t xml:space="preserve">Where: </w:t>
+      </w:r>
+      <w:r>
+        <w:rPr>
+          <w:rFonts w:ascii="Calibri" w:cs="Calibri" w:eastAsia="Calibri" w:hAnsi="Calibri"/>
+          <w:sz w:val="22"/>
+          <w:szCs w:val="22"/>
+        </w:rPr>
+        <w:t xml:space="preserve">github.com/mikelix/gstack-tutorial-1/issues → click New Issue → select the “Weekly Progress Report” template.</w:t>
+      </w:r>
+    </w:p>
+    <w:p>
+      <w:pPr>
+        <w:spacing w:after="100" w:before="100" w:line="240"/>
+      </w:pPr>
+      <w:r>
+        <w:rPr>
+          <w:rFonts w:ascii="Calibri" w:cs="Calibri" w:eastAsia="Calibri" w:hAnsi="Calibri"/>
+          <w:b/>
+          <w:bCs/>
+          <w:color w:val="1F4E78"/>
+          <w:sz w:val="22"/>
+          <w:szCs w:val="22"/>
+        </w:rPr>
+        <w:t xml:space="preserve">Note: </w:t>
+      </w:r>
+      <w:r>
+        <w:rPr>
+          <w:rFonts w:ascii="Calibri" w:cs="Calibri" w:eastAsia="Calibri" w:hAnsi="Calibri"/>
+          <w:sz w:val="22"/>
+          <w:szCs w:val="22"/>
+        </w:rPr>
+        <w:t xml:space="preserve">post to the ORIGINAL repo's issues, not your own fork's issues — that's where the instructor looks.</w:t>
+      </w:r>
+    </w:p>
+    <w:p>
+      <w:pPr>
+        <w:spacing w:after="150" w:before="200" w:line="280"/>
+      </w:pPr>
+      <w:r>
+        <w:rPr>
+          <w:rFonts w:ascii="Calibri" w:cs="Calibri" w:eastAsia="Calibri" w:hAnsi="Calibri"/>
+          <w:sz w:val="22"/>
+          <w:szCs w:val="22"/>
+        </w:rPr>
+        <w:t xml:space="preserve">The template auto-fills when you click New Issue, but three fields at the top are required on every report:</w:t>
+      </w:r>
+    </w:p>
+    <w:p>
+      <w:pPr>
+        <w:pStyle w:val="ListParagraph"/>
+        <w:numPr>
+          <w:ilvl w:val="0"/>
+          <w:numId w:val="1"/>
+        </w:numPr>
+        <w:spacing w:after="100" w:before="100" w:line="240"/>
+      </w:pPr>
+      <w:r>
+        <w:rPr>
+          <w:rFonts w:ascii="Calibri" w:cs="Calibri" w:eastAsia="Calibri" w:hAnsi="Calibri"/>
+          <w:b/>
+          <w:bCs/>
+          <w:sz w:val="22"/>
+          <w:szCs w:val="22"/>
+        </w:rPr>
+        <w:t xml:space="preserve">User's Name — </w:t>
+      </w:r>
+      <w:r>
+        <w:rPr>
+          <w:rFonts w:ascii="Calibri" w:cs="Calibri" w:eastAsia="Calibri" w:hAnsi="Calibri"/>
+          <w:sz w:val="22"/>
+          <w:szCs w:val="22"/>
+        </w:rPr>
+        <w:t xml:space="preserve">your full name, so the instructor knows who is reporting</w:t>
+      </w:r>
+    </w:p>
+    <w:p>
+      <w:pPr>
+        <w:pStyle w:val="ListParagraph"/>
+        <w:numPr>
+          <w:ilvl w:val="0"/>
+          <w:numId w:val="1"/>
+        </w:numPr>
+        <w:spacing w:after="100" w:before="100" w:line="240"/>
+      </w:pPr>
+      <w:r>
+        <w:rPr>
+          <w:rFonts w:ascii="Calibri" w:cs="Calibri" w:eastAsia="Calibri" w:hAnsi="Calibri"/>
+          <w:b/>
+          <w:bCs/>
+          <w:sz w:val="22"/>
+          <w:szCs w:val="22"/>
+        </w:rPr>
+        <w:t xml:space="preserve">Project — </w:t>
+      </w:r>
+      <w:r>
+        <w:rPr>
+          <w:rFonts w:ascii="Calibri" w:cs="Calibri" w:eastAsia="Calibri" w:hAnsi="Calibri"/>
+          <w:sz w:val="22"/>
+          <w:szCs w:val="22"/>
+        </w:rPr>
+        <w:t xml:space="preserve">Gstack Tutorial #1 (this exact name)</w:t>
+      </w:r>
+    </w:p>
+    <w:p>
+      <w:pPr>
+        <w:pStyle w:val="ListParagraph"/>
+        <w:numPr>
+          <w:ilvl w:val="0"/>
+          <w:numId w:val="1"/>
+        </w:numPr>
+        <w:spacing w:after="300" w:before="100" w:line="240"/>
+      </w:pPr>
+      <w:r>
+        <w:rPr>
+          <w:rFonts w:ascii="Calibri" w:cs="Calibri" w:eastAsia="Calibri" w:hAnsi="Calibri"/>
+          <w:b/>
+          <w:bCs/>
+          <w:sz w:val="22"/>
+          <w:szCs w:val="22"/>
+        </w:rPr>
+        <w:t xml:space="preserve">Submission Date — </w:t>
+      </w:r>
+      <w:r>
+        <w:rPr>
+          <w:rFonts w:ascii="Calibri" w:cs="Calibri" w:eastAsia="Calibri" w:hAnsi="Calibri"/>
+          <w:sz w:val="22"/>
+          <w:szCs w:val="22"/>
+        </w:rPr>
+        <w:t xml:space="preserve">day/month/year format, e.g. 15/10/2026</w:t>
+      </w:r>
+    </w:p>
+    <w:p>
+      <w:pPr>
+        <w:spacing w:after="200" w:line="240"/>
+      </w:pPr>
+      <w:r>
+        <w:rPr>
+          <w:rFonts w:ascii="Calibri" w:cs="Calibri" w:eastAsia="Calibri" w:hAnsi="Calibri"/>
+          <w:sz w:val="22"/>
+          <w:szCs w:val="22"/>
+        </w:rPr>
+        <w:t xml:space="preserve">Also include: which fork you're working from (link it), what you tried, the exact error message if you have one (“it didn't work” is hard to help with — “Word showed unspecified error, line:0 column:0” is easy to help with), and your plan for next week.</w:t>
+      </w:r>
+    </w:p>
+    <w:p>
+      <w:pPr>
+        <w:spacing w:after="400" w:line="240"/>
+      </w:pPr>
+      <w:r>
+        <w:rPr>
+          <w:rFonts w:ascii="Calibri" w:cs="Calibri" w:eastAsia="Calibri" w:hAnsi="Calibri"/>
+          <w:sz w:val="22"/>
+          <w:szCs w:val="22"/>
+        </w:rPr>
+        <w:t xml:space="preserve">The full template lives at </w:t>
+      </w:r>
+      <w:r>
+        <w:rPr>
+          <w:rFonts w:ascii="Consolas" w:cs="Consolas" w:eastAsia="Consolas" w:hAnsi="Consolas"/>
+          <w:color w:val="1F4E78"/>
+          <w:sz w:val="20"/>
+          <w:szCs w:val="20"/>
+        </w:rPr>
+        <w:t xml:space="preserve">.github/ISSUE_TEMPLATE/weekly_progress_report.md</w:t>
+      </w:r>
+      <w:r>
+        <w:rPr>
+          <w:rFonts w:ascii="Calibri" w:cs="Calibri" w:eastAsia="Calibri" w:hAnsi="Calibri"/>
+          <w:sz w:val="22"/>
+          <w:szCs w:val="22"/>
+        </w:rPr>
+        <w:t xml:space="preserve"> in the repo — read it once so you know what's expected.</w:t>
       </w:r>
     </w:p>
     <w:sectPr>

</xml_diff>